<commit_message>
code improvements IAW OLA feedback
</commit_message>
<xml_diff>
--- a/IFQ714 A1 report-Feiersinger.docx
+++ b/IFQ714 A1 report-Feiersinger.docx
@@ -25,7 +25,7 @@
         <w:rPr/>
         <w:t>David Feiersinger</w:t>
         <w:br/>
-        <w:t>15Aug26</w:t>
+        <w:t>21Aug26</w:t>
       </w:r>
     </w:p>
     <w:p>
@@ -601,7 +601,15 @@
       </w:pPr>
       <w:r>
         <w:rPr/>
-        <w:t>Apollo orbit class filter and math function output was verified using the Jest testing framework. The test confirmed expected results for 'largest 10 NEO' and Apollo object sort by quantity.</w:t>
+        <w:t>Apollo orbit class filter and math function output was verified using the Jest testing framework. The test confirmed expected results for 'largest 10 NEO' and Apollo object sort by quantity. 'not.toBe'</w:t>
+      </w:r>
+      <w:r>
+        <w:rPr/>
+        <w:t xml:space="preserve"> </w:t>
+      </w:r>
+      <w:r>
+        <w:rPr/>
+        <w:t>check was used to validate non-shared memory reference for the deep copy.</w:t>
       </w:r>
     </w:p>
     <w:p>
@@ -658,11 +666,7 @@
       </w:pPr>
       <w:r>
         <w:rPr/>
-        <w:t>I had challenges with 'calling out' parsed data into required functions, often receiving errors that I had not idea how to rectify. Further investigation identified syntactical anomalies, and this was a great learning experience. I had similar issues when importing data for jest evaluation</w:t>
-      </w:r>
-      <w:r>
-        <w:rPr/>
-        <w:t xml:space="preserve"> (I had issues with non-conventional file name (must be 'xx.test.js').</w:t>
+        <w:t>I had challenges with 'calling out' parsed data into required functions, often receiving errors that I had not idea how to rectify. Further investigation identified syntactical anomalies, and this was a great learning experience. I had similar issues when importing data for jest evaluation (I had issues with non-conventional file name (must be 'xx.test.js').</w:t>
       </w:r>
     </w:p>
     <w:p>
@@ -822,7 +826,7 @@
       </w:pPr>
       <w:r>
         <w:rPr/>
-        <w:t>Having no coding experience whatsoever, this assignment has been a significant challenge (I didn't even know what JavaScript was...).</w:t>
+        <w:t>Having no coding experience, this assignment has been a significant challenge (I didn't even know what JavaScript was...).</w:t>
         <w:br/>
         <w:t>Learning how to setup and work with new software, as well as understanding structures and machinations of the JavaScript language -it has been an exciting journey so-far.</w:t>
         <w:br/>

</xml_diff>